<commit_message>
docs: replace AWS references with Google Cloud Run and add app screenshots
</commit_message>
<xml_diff>
--- a/Week 15/Task1_Documentation.docx
+++ b/Week 15/Task1_Documentation.docx
@@ -335,13 +335,13 @@
       </w:r>
     </w:p>
     <w:bookmarkEnd w:id="10"/>
-    <w:bookmarkStart w:id="11" w:name="deployment-aws-ecs-fargate"/>
+    <w:bookmarkStart w:id="11" w:name="deployment-google-cloud-run"/>
     <w:p>
       <w:pPr>
         <w:pStyle w:val="Heading2"/>
       </w:pPr>
       <w:r>
-        <w:t xml:space="preserve">☁️ Deployment (AWS ECS Fargate)</w:t>
+        <w:t xml:space="preserve">☁️ Deployment (Google Cloud Run)</w:t>
       </w:r>
     </w:p>
     <w:p>
@@ -349,7 +349,7 @@
         <w:pStyle w:val="FirstParagraph"/>
       </w:pPr>
       <w:r>
-        <w:t xml:space="preserve">The stack is configured to deploy to AWS Elastic Container Service (ECS) using Serverless Fargate.</w:t>
+        <w:t xml:space="preserve">The stack is configured to deploy to Google Cloud Run using serverless containers.</w:t>
       </w:r>
       <w:r>
         <w:t xml:space="preserve"> </w:t>
@@ -365,7 +365,7 @@
           <w:b/>
           <w:bCs/>
         </w:rPr>
-        <w:t xml:space="preserve">Elastic Container Registry (ECR)</w:t>
+        <w:t xml:space="preserve">Google Container Registry (GCR)</w:t>
       </w:r>
       <w:r>
         <w:t xml:space="preserve">: Automated scripts to tag and push the</w:t>
@@ -414,10 +414,10 @@
           <w:b/>
           <w:bCs/>
         </w:rPr>
-        <w:t xml:space="preserve">Application Load Balancer (ALB)</w:t>
-      </w:r>
-      <w:r>
-        <w:t xml:space="preserve">: Routes public internet traffic directly to the containerized frontend.</w:t>
+        <w:t xml:space="preserve">Cloud Run Endpoints</w:t>
+      </w:r>
+      <w:r>
+        <w:t xml:space="preserve">: Routes public internet traffic directly to the containerized frontend and backend.</w:t>
       </w:r>
       <w:r>
         <w:t xml:space="preserve"> </w:t>
@@ -433,7 +433,7 @@
           <w:b/>
           <w:bCs/>
         </w:rPr>
-        <w:t xml:space="preserve">AWS Parameter Store</w:t>
+        <w:t xml:space="preserve">Environment Variables</w:t>
       </w:r>
       <w:r>
         <w:t xml:space="preserve">: Secures API Keys (</w:t>
@@ -457,7 +457,7 @@
         <w:t xml:space="preserve">OPENAI_API_KEY</w:t>
       </w:r>
       <w:r>
-        <w:t xml:space="preserve">) as encrypted secrets injected directly into the Fargate execution roles.</w:t>
+        <w:t xml:space="preserve">) injected directly into the Cloud Run service.</w:t>
       </w:r>
     </w:p>
     <w:bookmarkEnd w:id="11"/>
@@ -907,13 +907,13 @@
       </w:r>
     </w:p>
     <w:bookmarkEnd w:id="13"/>
-    <w:bookmarkStart w:id="14" w:name="aws-deployment"/>
+    <w:bookmarkStart w:id="14" w:name="google-cloud-run-deployment"/>
     <w:p>
       <w:pPr>
         <w:pStyle w:val="Heading3"/>
       </w:pPr>
       <w:r>
-        <w:t xml:space="preserve">3. AWS Deployment</w:t>
+        <w:t xml:space="preserve">3. Google Cloud Run Deployment</w:t>
       </w:r>
     </w:p>
     <w:p>
@@ -921,7 +921,7 @@
         <w:pStyle w:val="FirstParagraph"/>
       </w:pPr>
       <w:r>
-        <w:t xml:space="preserve">To push the system to AWS ECR:</w:t>
+        <w:t xml:space="preserve">To push the system to Google Cloud Run:</w:t>
       </w:r>
     </w:p>
     <w:p>
@@ -932,126 +932,37 @@
         <w:rPr>
           <w:rStyle w:val="BuiltInTok"/>
         </w:rPr>
-        <w:t xml:space="preserve">export</w:t>
-      </w:r>
-      <w:r>
-        <w:rPr>
-          <w:rStyle w:val="NormalTok"/>
-        </w:rPr>
-        <w:t xml:space="preserve"> </w:t>
-      </w:r>
-      <w:r>
-        <w:rPr>
-          <w:rStyle w:val="VariableTok"/>
-        </w:rPr>
-        <w:t xml:space="preserve">AWS_ACCOUNT_ID</w:t>
-      </w:r>
-      <w:r>
-        <w:rPr>
-          <w:rStyle w:val="OperatorTok"/>
-        </w:rPr>
-        <w:t xml:space="preserve">=</w:t>
-      </w:r>
-      <w:r>
-        <w:rPr>
-          <w:rStyle w:val="StringTok"/>
-        </w:rPr>
-        <w:t xml:space="preserve">"your-aws-account-id"</w:t>
+        <w:t xml:space="preserve">cd</w:t>
+      </w:r>
+      <w:r>
+        <w:rPr>
+          <w:rStyle w:val="NormalTok"/>
+        </w:rPr>
+        <w:t xml:space="preserve"> ../task2-production</w:t>
       </w:r>
       <w:r>
         <w:br/>
       </w:r>
       <w:r>
         <w:rPr>
-          <w:rStyle w:val="BuiltInTok"/>
-        </w:rPr>
-        <w:t xml:space="preserve">export</w:t>
-      </w:r>
-      <w:r>
-        <w:rPr>
-          <w:rStyle w:val="NormalTok"/>
-        </w:rPr>
-        <w:t xml:space="preserve"> </w:t>
-      </w:r>
-      <w:r>
-        <w:rPr>
-          <w:rStyle w:val="VariableTok"/>
-        </w:rPr>
-        <w:t xml:space="preserve">AWS_REGION</w:t>
-      </w:r>
-      <w:r>
-        <w:rPr>
-          <w:rStyle w:val="OperatorTok"/>
-        </w:rPr>
-        <w:t xml:space="preserve">=</w:t>
-      </w:r>
-      <w:r>
-        <w:rPr>
-          <w:rStyle w:val="StringTok"/>
-        </w:rPr>
-        <w:t xml:space="preserve">"us-east-1"</w:t>
+          <w:rStyle w:val="FunctionTok"/>
+        </w:rPr>
+        <w:t xml:space="preserve">chmod</w:t>
+      </w:r>
+      <w:r>
+        <w:rPr>
+          <w:rStyle w:val="NormalTok"/>
+        </w:rPr>
+        <w:t xml:space="preserve"> +x deploy-cloudrun.sh</w:t>
       </w:r>
       <w:r>
         <w:br/>
       </w:r>
       <w:r>
         <w:rPr>
-          <w:rStyle w:val="BuiltInTok"/>
-        </w:rPr>
-        <w:t xml:space="preserve">cd</w:t>
-      </w:r>
-      <w:r>
-        <w:rPr>
-          <w:rStyle w:val="NormalTok"/>
-        </w:rPr>
-        <w:t xml:space="preserve"> ../task2-production/deploy/aws</w:t>
-      </w:r>
-      <w:r>
-        <w:br/>
-      </w:r>
-      <w:r>
-        <w:rPr>
-          <w:rStyle w:val="FunctionTok"/>
-        </w:rPr>
-        <w:t xml:space="preserve">chmod</w:t>
-      </w:r>
-      <w:r>
-        <w:rPr>
-          <w:rStyle w:val="NormalTok"/>
-        </w:rPr>
-        <w:t xml:space="preserve"> +x deploy.sh</w:t>
-      </w:r>
-      <w:r>
-        <w:br/>
-      </w:r>
-      <w:r>
-        <w:rPr>
           <w:rStyle w:val="ExtensionTok"/>
         </w:rPr>
-        <w:t xml:space="preserve">./deploy.sh</w:t>
-      </w:r>
-    </w:p>
-    <w:p>
-      <w:pPr>
-        <w:pStyle w:val="FirstParagraph"/>
-      </w:pPr>
-      <w:r>
-        <w:t xml:space="preserve">Follow the detailed guide in</w:t>
-      </w:r>
-      <w:r>
-        <w:t xml:space="preserve"> </w:t>
-      </w:r>
-      <w:r>
-        <w:rPr>
-          <w:rStyle w:val="VerbatimChar"/>
-        </w:rPr>
-        <w:t xml:space="preserve">task2-production/deploy/aws/README.md</w:t>
-      </w:r>
-      <w:r>
-        <w:t xml:space="preserve"> </w:t>
-      </w:r>
-      <w:r>
-        <w:t xml:space="preserve">to register the ECS tasks.</w:t>
+        <w:t xml:space="preserve">./deploy-cloudrun.sh</w:t>
       </w:r>
     </w:p>
     <w:bookmarkEnd w:id="14"/>

</xml_diff>